<commit_message>
some formatting fixes and broken link updates
</commit_message>
<xml_diff>
--- a/myCV.docx
+++ b/myCV.docx
@@ -37,13 +37,7 @@
         </w:r>
       </w:hyperlink>
       <w:r>
-        <w:t xml:space="preserve"> </w:t>
-      </w:r>
-      <w:r>
-        <w:t xml:space="preserve">|</w:t>
-      </w:r>
-      <w:r>
-        <w:t xml:space="preserve"> </w:t>
+        <w:br/>
       </w:r>
       <w:r>
         <w:t xml:space="preserve"> </w:t>
@@ -178,7 +172,7 @@
         <w:t xml:space="preserve">R Ecosystem</w:t>
       </w:r>
       <w:r>
-        <w:t xml:space="preserve">: Shiny, tidyverse, Package Development (CRAN)</w:t>
+        <w:t xml:space="preserve">: Shiny, tidyverse, Package Development</w:t>
       </w:r>
     </w:p>
     <w:p>
@@ -422,7 +416,7 @@
         </w:numPr>
       </w:pPr>
       <w:r>
-        <w:t xml:space="preserve">Lead a team of 3 developers, overseeing architecture decisions, sprint planning, and mentoring team members through regular one-on-ones.</w:t>
+        <w:t xml:space="preserve">Lead the development team, overseeing architecture decisions and sprint planning.</w:t>
       </w:r>
     </w:p>
     <w:bookmarkEnd w:id="16"/>
@@ -1348,13 +1342,13 @@
           <w:i/>
           <w:iCs/>
         </w:rPr>
-        <w:t xml:space="preserve">Deal Makers Magazine</w:t>
-      </w:r>
-      <w:r>
-        <w:t xml:space="preserve"> </w:t>
-      </w:r>
-      <w:r>
-        <w:t xml:space="preserve">(June 2021), co-authored with David Holland:</w:t>
+        <w:t xml:space="preserve">Catalyst</w:t>
+      </w:r>
+      <w:r>
+        <w:t xml:space="preserve"> </w:t>
+      </w:r>
+      <w:r>
+        <w:t xml:space="preserve">(DealMakers), June Quarter 2021, co-authored with David Holland:</w:t>
       </w:r>
       <w:r>
         <w:t xml:space="preserve"> </w:t>
@@ -1364,7 +1358,7 @@
           <w:rPr>
             <w:rStyle w:val="Hyperlink"/>
           </w:rPr>
-          <w:t xml:space="preserve">Deal Makers Magazine</w:t>
+          <w:t xml:space="preserve">Read Article</w:t>
         </w:r>
       </w:hyperlink>
     </w:p>
@@ -1428,13 +1422,13 @@
         </w:numPr>
       </w:pPr>
       <w:r>
-        <w:t xml:space="preserve">“Productivity hacks with your Rprofile,”</w:t>
-      </w:r>
-      <w:r>
-        <w:t xml:space="preserve"> </w:t>
-      </w:r>
-      <w:r>
-        <w:t xml:space="preserve">SatRday Conference (2020):</w:t>
+        <w:t xml:space="preserve">“Productivity Hacks with your .Rprofile,”</w:t>
+      </w:r>
+      <w:r>
+        <w:t xml:space="preserve"> </w:t>
+      </w:r>
+      <w:r>
+        <w:t xml:space="preserve">satRday Joburg (2020):</w:t>
       </w:r>
       <w:r>
         <w:t xml:space="preserve"> </w:t>
@@ -1457,13 +1451,13 @@
         </w:numPr>
       </w:pPr>
       <w:r>
-        <w:t xml:space="preserve">“Integrating Excel with R,”</w:t>
-      </w:r>
-      <w:r>
-        <w:t xml:space="preserve"> </w:t>
-      </w:r>
-      <w:r>
-        <w:t xml:space="preserve">SatRday Conference (2019):</w:t>
+        <w:t xml:space="preserve">“EXCELsioR!”</w:t>
+      </w:r>
+      <w:r>
+        <w:t xml:space="preserve"> </w:t>
+      </w:r>
+      <w:r>
+        <w:t xml:space="preserve">on integrating Excel with R, satRday Joburg (2019):</w:t>
       </w:r>
       <w:r>
         <w:t xml:space="preserve"> </w:t>

</xml_diff>